<commit_message>
add three test cases
</commit_message>
<xml_diff>
--- a/Assignment2/COS30019 - Who did What.docx
+++ b/Assignment2/COS30019 - Who did What.docx
@@ -1,6 +1,6 @@
 
 <file path=word/document.xml><?xml version="1.0" encoding="utf-8"?>
-<w:document xmlns:wpc="http://schemas.microsoft.com/office/word/2010/wordprocessingCanvas" xmlns:cx="http://schemas.microsoft.com/office/drawing/2014/chartex" xmlns:cx1="http://schemas.microsoft.com/office/drawing/2015/9/8/chartex" xmlns:cx2="http://schemas.microsoft.com/office/drawing/2015/10/21/chartex" xmlns:cx3="http://schemas.microsoft.com/office/drawing/2016/5/9/chartex" xmlns:cx4="http://schemas.microsoft.com/office/drawing/2016/5/10/chartex" xmlns:cx5="http://schemas.microsoft.com/office/drawing/2016/5/11/chartex" xmlns:cx6="http://schemas.microsoft.com/office/drawing/2016/5/12/chartex" xmlns:cx7="http://schemas.microsoft.com/office/drawing/2016/5/13/chartex" xmlns:cx8="http://schemas.microsoft.com/office/drawing/2016/5/14/chartex" xmlns:mc="http://schemas.openxmlformats.org/markup-compatibility/2006" xmlns:aink="http://schemas.microsoft.com/office/drawing/2016/ink" xmlns:am3d="http://schemas.microsoft.com/office/drawing/2017/model3d" xmlns:o="urn:schemas-microsoft-com:office:office" xmlns:r="http://schemas.openxmlformats.org/officeDocument/2006/relationships" xmlns:m="http://schemas.openxmlformats.org/officeDocument/2006/math" xmlns:v="urn:schemas-microsoft-com:vml" xmlns:wp14="http://schemas.microsoft.com/office/word/2010/wordprocessingDrawing" xmlns:wp="http://schemas.openxmlformats.org/drawingml/2006/wordprocessingDrawing" xmlns:w10="urn:schemas-microsoft-com:office:word" xmlns:w="http://schemas.openxmlformats.org/wordprocessingml/2006/main" xmlns:w14="http://schemas.microsoft.com/office/word/2010/wordml" xmlns:w15="http://schemas.microsoft.com/office/word/2012/wordml" xmlns:w16cex="http://schemas.microsoft.com/office/word/2018/wordml/cex" xmlns:w16cid="http://schemas.microsoft.com/office/word/2016/wordml/cid" xmlns:w16="http://schemas.microsoft.com/office/word/2018/wordml" xmlns:w16sdtdh="http://schemas.microsoft.com/office/word/2020/wordml/sdtdatahash" xmlns:w16se="http://schemas.microsoft.com/office/word/2015/wordml/symex" xmlns:wpg="http://schemas.microsoft.com/office/word/2010/wordprocessingGroup" xmlns:wpi="http://schemas.microsoft.com/office/word/2010/wordprocessingInk" xmlns:wne="http://schemas.microsoft.com/office/word/2006/wordml" xmlns:wps="http://schemas.microsoft.com/office/word/2010/wordprocessingShape" mc:Ignorable="w14 w15 w16se w16cid w16 w16cex w16sdtdh wp14">
+<w:document xmlns:wpc="http://schemas.microsoft.com/office/word/2010/wordprocessingCanvas" xmlns:cx="http://schemas.microsoft.com/office/drawing/2014/chartex" xmlns:cx1="http://schemas.microsoft.com/office/drawing/2015/9/8/chartex" xmlns:cx2="http://schemas.microsoft.com/office/drawing/2015/10/21/chartex" xmlns:cx3="http://schemas.microsoft.com/office/drawing/2016/5/9/chartex" xmlns:cx4="http://schemas.microsoft.com/office/drawing/2016/5/10/chartex" xmlns:cx5="http://schemas.microsoft.com/office/drawing/2016/5/11/chartex" xmlns:cx6="http://schemas.microsoft.com/office/drawing/2016/5/12/chartex" xmlns:cx7="http://schemas.microsoft.com/office/drawing/2016/5/13/chartex" xmlns:cx8="http://schemas.microsoft.com/office/drawing/2016/5/14/chartex" xmlns:mc="http://schemas.openxmlformats.org/markup-compatibility/2006" xmlns:aink="http://schemas.microsoft.com/office/drawing/2016/ink" xmlns:am3d="http://schemas.microsoft.com/office/drawing/2017/model3d" xmlns:o="urn:schemas-microsoft-com:office:office" xmlns:oel="http://schemas.microsoft.com/office/2019/extlst" xmlns:r="http://schemas.openxmlformats.org/officeDocument/2006/relationships" xmlns:m="http://schemas.openxmlformats.org/officeDocument/2006/math" xmlns:v="urn:schemas-microsoft-com:vml" xmlns:wp14="http://schemas.microsoft.com/office/word/2010/wordprocessingDrawing" xmlns:wp="http://schemas.openxmlformats.org/drawingml/2006/wordprocessingDrawing" xmlns:w10="urn:schemas-microsoft-com:office:word" xmlns:w="http://schemas.openxmlformats.org/wordprocessingml/2006/main" xmlns:w14="http://schemas.microsoft.com/office/word/2010/wordml" xmlns:w15="http://schemas.microsoft.com/office/word/2012/wordml" xmlns:w16cex="http://schemas.microsoft.com/office/word/2018/wordml/cex" xmlns:w16cid="http://schemas.microsoft.com/office/word/2016/wordml/cid" xmlns:w16="http://schemas.microsoft.com/office/word/2018/wordml" xmlns:w16du="http://schemas.microsoft.com/office/word/2023/wordml/word16du" xmlns:w16sdtdh="http://schemas.microsoft.com/office/word/2020/wordml/sdtdatahash" xmlns:w16sdtfl="http://schemas.microsoft.com/office/word/2024/wordml/sdtformatlock" xmlns:w16se="http://schemas.microsoft.com/office/word/2015/wordml/symex" xmlns:wpg="http://schemas.microsoft.com/office/word/2010/wordprocessingGroup" xmlns:wpi="http://schemas.microsoft.com/office/word/2010/wordprocessingInk" xmlns:wne="http://schemas.microsoft.com/office/word/2006/wordml" xmlns:wps="http://schemas.microsoft.com/office/word/2010/wordprocessingShape" mc:Ignorable="w14 w15 w16se w16cid w16 w16cex w16sdtdh w16sdtfl w16du wp14">
   <w:body>
     <w:p>
       <w:pPr>
@@ -459,7 +459,35 @@
               <w:rPr>
                 <w:sz w:val="20"/>
               </w:rPr>
-              <w:t xml:space="preserve"> (have to submitted as well)</w:t>
+              <w:t xml:space="preserve"> (</w:t>
+            </w:r>
+            <w:proofErr w:type="gramStart"/>
+            <w:r>
+              <w:rPr>
+                <w:sz w:val="20"/>
+              </w:rPr>
+              <w:t>have to</w:t>
+            </w:r>
+            <w:proofErr w:type="gramEnd"/>
+            <w:r>
+              <w:rPr>
+                <w:sz w:val="20"/>
+              </w:rPr>
+              <w:t xml:space="preserve"> </w:t>
+            </w:r>
+            <w:proofErr w:type="gramStart"/>
+            <w:r>
+              <w:rPr>
+                <w:sz w:val="20"/>
+              </w:rPr>
+              <w:t>submitted</w:t>
+            </w:r>
+            <w:proofErr w:type="gramEnd"/>
+            <w:r>
+              <w:rPr>
+                <w:sz w:val="20"/>
+              </w:rPr>
+              <w:t xml:space="preserve"> as well)</w:t>
             </w:r>
           </w:p>
         </w:tc>
@@ -1233,7 +1261,15 @@
         <w:jc w:val="both"/>
       </w:pPr>
       <w:r>
-        <w:t>As you are to be individually assessed it is necessary to ensure your marker understands your individual contribution. This</w:t>
+        <w:t xml:space="preserve">As you are to be individually </w:t>
+      </w:r>
+      <w:proofErr w:type="gramStart"/>
+      <w:r>
+        <w:t>assessed</w:t>
+      </w:r>
+      <w:proofErr w:type="gramEnd"/>
+      <w:r>
+        <w:t xml:space="preserve"> it is necessary to ensure your marker understands your individual contribution. This</w:t>
       </w:r>
       <w:r>
         <w:rPr>
@@ -1702,6 +1738,204 @@
               <w:pStyle w:val="TableParagraph"/>
               <w:spacing w:before="120"/>
               <w:ind w:left="105"/>
+              <w:rPr>
+                <w:sz w:val="20"/>
+              </w:rPr>
+            </w:pPr>
+            <w:r>
+              <w:rPr>
+                <w:sz w:val="20"/>
+              </w:rPr>
+              <w:t>You may also add comments to further explain your contribution or partial contribution to an activity.</w:t>
+            </w:r>
+          </w:p>
+        </w:tc>
+      </w:tr>
+      <w:tr>
+        <w:trPr>
+          <w:trHeight w:val="1049"/>
+        </w:trPr>
+        <w:tc>
+          <w:tcPr>
+            <w:tcW w:w="2069" w:type="dxa"/>
+          </w:tcPr>
+          <w:p>
+            <w:pPr>
+              <w:pStyle w:val="TableParagraph"/>
+              <w:ind w:left="107"/>
+              <w:rPr>
+                <w:sz w:val="20"/>
+              </w:rPr>
+            </w:pPr>
+            <w:r>
+              <w:rPr>
+                <w:sz w:val="20"/>
+              </w:rPr>
+              <w:t xml:space="preserve">Member </w:t>
+            </w:r>
+            <w:r>
+              <w:rPr>
+                <w:sz w:val="20"/>
+              </w:rPr>
+              <w:t>2</w:t>
+            </w:r>
+          </w:p>
+        </w:tc>
+        <w:tc>
+          <w:tcPr>
+            <w:tcW w:w="7965" w:type="dxa"/>
+          </w:tcPr>
+          <w:p>
+            <w:pPr>
+              <w:pStyle w:val="TableParagraph"/>
+              <w:ind w:left="105" w:right="435"/>
+              <w:rPr>
+                <w:sz w:val="20"/>
+              </w:rPr>
+            </w:pPr>
+            <w:r>
+              <w:rPr>
+                <w:sz w:val="20"/>
+              </w:rPr>
+              <w:t>Activity (these are suggestions of the ways you may have contributed. There may be others and some may not be applicable).</w:t>
+            </w:r>
+          </w:p>
+          <w:p>
+            <w:pPr>
+              <w:pStyle w:val="TableParagraph"/>
+              <w:ind w:left="105" w:right="435"/>
+              <w:rPr>
+                <w:sz w:val="20"/>
+              </w:rPr>
+            </w:pPr>
+            <w:r>
+              <w:rPr>
+                <w:sz w:val="20"/>
+              </w:rPr>
+              <w:t>You may also add comments to further explain your contribution or partial contribution to an activity.</w:t>
+            </w:r>
+          </w:p>
+        </w:tc>
+      </w:tr>
+      <w:tr>
+        <w:trPr>
+          <w:trHeight w:val="1049"/>
+        </w:trPr>
+        <w:tc>
+          <w:tcPr>
+            <w:tcW w:w="2069" w:type="dxa"/>
+          </w:tcPr>
+          <w:p>
+            <w:pPr>
+              <w:pStyle w:val="TableParagraph"/>
+              <w:ind w:left="107"/>
+              <w:rPr>
+                <w:sz w:val="20"/>
+              </w:rPr>
+            </w:pPr>
+            <w:r>
+              <w:rPr>
+                <w:sz w:val="20"/>
+              </w:rPr>
+              <w:t xml:space="preserve">Member </w:t>
+            </w:r>
+            <w:r>
+              <w:rPr>
+                <w:sz w:val="20"/>
+              </w:rPr>
+              <w:t>3</w:t>
+            </w:r>
+          </w:p>
+        </w:tc>
+        <w:tc>
+          <w:tcPr>
+            <w:tcW w:w="7965" w:type="dxa"/>
+          </w:tcPr>
+          <w:p>
+            <w:pPr>
+              <w:pStyle w:val="TableParagraph"/>
+              <w:ind w:left="105" w:right="435"/>
+              <w:rPr>
+                <w:sz w:val="20"/>
+              </w:rPr>
+            </w:pPr>
+            <w:r>
+              <w:rPr>
+                <w:sz w:val="20"/>
+              </w:rPr>
+              <w:t>Activity (these are suggestions of the ways you may have contributed. There may be others and some may not be applicable).</w:t>
+            </w:r>
+          </w:p>
+          <w:p>
+            <w:pPr>
+              <w:pStyle w:val="TableParagraph"/>
+              <w:ind w:left="105" w:right="435"/>
+              <w:rPr>
+                <w:sz w:val="20"/>
+              </w:rPr>
+            </w:pPr>
+            <w:r>
+              <w:rPr>
+                <w:sz w:val="20"/>
+              </w:rPr>
+              <w:t>You may also add comments to further explain your contribution or partial contribution to an activity.</w:t>
+            </w:r>
+          </w:p>
+        </w:tc>
+      </w:tr>
+      <w:tr>
+        <w:trPr>
+          <w:trHeight w:val="1049"/>
+        </w:trPr>
+        <w:tc>
+          <w:tcPr>
+            <w:tcW w:w="2069" w:type="dxa"/>
+          </w:tcPr>
+          <w:p>
+            <w:pPr>
+              <w:pStyle w:val="TableParagraph"/>
+              <w:ind w:left="107"/>
+              <w:rPr>
+                <w:sz w:val="20"/>
+              </w:rPr>
+            </w:pPr>
+            <w:r>
+              <w:rPr>
+                <w:sz w:val="20"/>
+              </w:rPr>
+              <w:t xml:space="preserve">Member </w:t>
+            </w:r>
+            <w:r>
+              <w:rPr>
+                <w:sz w:val="20"/>
+              </w:rPr>
+              <w:t>4</w:t>
+            </w:r>
+          </w:p>
+        </w:tc>
+        <w:tc>
+          <w:tcPr>
+            <w:tcW w:w="7965" w:type="dxa"/>
+          </w:tcPr>
+          <w:p>
+            <w:pPr>
+              <w:pStyle w:val="TableParagraph"/>
+              <w:ind w:left="105" w:right="435"/>
+              <w:rPr>
+                <w:sz w:val="20"/>
+              </w:rPr>
+            </w:pPr>
+            <w:r>
+              <w:rPr>
+                <w:sz w:val="20"/>
+              </w:rPr>
+              <w:t>Activity (these are suggestions of the ways you may have contributed. There may be others and some may not be applicable).</w:t>
+            </w:r>
+          </w:p>
+          <w:p>
+            <w:pPr>
+              <w:pStyle w:val="TableParagraph"/>
+              <w:ind w:left="105" w:right="435"/>
               <w:rPr>
                 <w:sz w:val="20"/>
               </w:rPr>
@@ -1972,6 +2206,53 @@
           </w:p>
         </w:tc>
       </w:tr>
+      <w:tr>
+        <w:trPr>
+          <w:trHeight w:val="594"/>
+        </w:trPr>
+        <w:tc>
+          <w:tcPr>
+            <w:tcW w:w="3795" w:type="dxa"/>
+          </w:tcPr>
+          <w:p>
+            <w:pPr>
+              <w:pStyle w:val="TableParagraph"/>
+              <w:ind w:left="107"/>
+              <w:rPr>
+                <w:sz w:val="20"/>
+              </w:rPr>
+            </w:pPr>
+          </w:p>
+        </w:tc>
+        <w:tc>
+          <w:tcPr>
+            <w:tcW w:w="4112" w:type="dxa"/>
+          </w:tcPr>
+          <w:p>
+            <w:pPr>
+              <w:pStyle w:val="TableParagraph"/>
+              <w:spacing w:before="93"/>
+              <w:rPr>
+                <w:rFonts w:ascii="Arial"/>
+                <w:sz w:val="30"/>
+              </w:rPr>
+            </w:pPr>
+          </w:p>
+        </w:tc>
+        <w:tc>
+          <w:tcPr>
+            <w:tcW w:w="2126" w:type="dxa"/>
+          </w:tcPr>
+          <w:p>
+            <w:pPr>
+              <w:pStyle w:val="TableParagraph"/>
+              <w:rPr>
+                <w:sz w:val="20"/>
+              </w:rPr>
+            </w:pPr>
+          </w:p>
+        </w:tc>
+      </w:tr>
     </w:tbl>
     <w:p/>
     <w:sectPr>
@@ -1984,7 +2265,7 @@
 </file>
 
 <file path=word/endnotes.xml><?xml version="1.0" encoding="utf-8"?>
-<w:endnotes xmlns:wpc="http://schemas.microsoft.com/office/word/2010/wordprocessingCanvas" xmlns:cx="http://schemas.microsoft.com/office/drawing/2014/chartex" xmlns:cx1="http://schemas.microsoft.com/office/drawing/2015/9/8/chartex" xmlns:cx2="http://schemas.microsoft.com/office/drawing/2015/10/21/chartex" xmlns:cx3="http://schemas.microsoft.com/office/drawing/2016/5/9/chartex" xmlns:cx4="http://schemas.microsoft.com/office/drawing/2016/5/10/chartex" xmlns:cx5="http://schemas.microsoft.com/office/drawing/2016/5/11/chartex" xmlns:cx6="http://schemas.microsoft.com/office/drawing/2016/5/12/chartex" xmlns:cx7="http://schemas.microsoft.com/office/drawing/2016/5/13/chartex" xmlns:cx8="http://schemas.microsoft.com/office/drawing/2016/5/14/chartex" xmlns:mc="http://schemas.openxmlformats.org/markup-compatibility/2006" xmlns:aink="http://schemas.microsoft.com/office/drawing/2016/ink" xmlns:am3d="http://schemas.microsoft.com/office/drawing/2017/model3d" xmlns:o="urn:schemas-microsoft-com:office:office" xmlns:r="http://schemas.openxmlformats.org/officeDocument/2006/relationships" xmlns:m="http://schemas.openxmlformats.org/officeDocument/2006/math" xmlns:v="urn:schemas-microsoft-com:vml" xmlns:wp14="http://schemas.microsoft.com/office/word/2010/wordprocessingDrawing" xmlns:wp="http://schemas.openxmlformats.org/drawingml/2006/wordprocessingDrawing" xmlns:w10="urn:schemas-microsoft-com:office:word" xmlns:w="http://schemas.openxmlformats.org/wordprocessingml/2006/main" xmlns:w14="http://schemas.microsoft.com/office/word/2010/wordml" xmlns:w15="http://schemas.microsoft.com/office/word/2012/wordml" xmlns:w16cex="http://schemas.microsoft.com/office/word/2018/wordml/cex" xmlns:w16cid="http://schemas.microsoft.com/office/word/2016/wordml/cid" xmlns:w16="http://schemas.microsoft.com/office/word/2018/wordml" xmlns:w16sdtdh="http://schemas.microsoft.com/office/word/2020/wordml/sdtdatahash" xmlns:w16se="http://schemas.microsoft.com/office/word/2015/wordml/symex" xmlns:wpg="http://schemas.microsoft.com/office/word/2010/wordprocessingGroup" xmlns:wpi="http://schemas.microsoft.com/office/word/2010/wordprocessingInk" xmlns:wne="http://schemas.microsoft.com/office/word/2006/wordml" xmlns:wps="http://schemas.microsoft.com/office/word/2010/wordprocessingShape" mc:Ignorable="w14 w15 w16se w16cid w16 w16cex w16sdtdh wp14">
+<w:endnotes xmlns:wpc="http://schemas.microsoft.com/office/word/2010/wordprocessingCanvas" xmlns:cx="http://schemas.microsoft.com/office/drawing/2014/chartex" xmlns:cx1="http://schemas.microsoft.com/office/drawing/2015/9/8/chartex" xmlns:cx2="http://schemas.microsoft.com/office/drawing/2015/10/21/chartex" xmlns:cx3="http://schemas.microsoft.com/office/drawing/2016/5/9/chartex" xmlns:cx4="http://schemas.microsoft.com/office/drawing/2016/5/10/chartex" xmlns:cx5="http://schemas.microsoft.com/office/drawing/2016/5/11/chartex" xmlns:cx6="http://schemas.microsoft.com/office/drawing/2016/5/12/chartex" xmlns:cx7="http://schemas.microsoft.com/office/drawing/2016/5/13/chartex" xmlns:cx8="http://schemas.microsoft.com/office/drawing/2016/5/14/chartex" xmlns:mc="http://schemas.openxmlformats.org/markup-compatibility/2006" xmlns:aink="http://schemas.microsoft.com/office/drawing/2016/ink" xmlns:am3d="http://schemas.microsoft.com/office/drawing/2017/model3d" xmlns:o="urn:schemas-microsoft-com:office:office" xmlns:oel="http://schemas.microsoft.com/office/2019/extlst" xmlns:r="http://schemas.openxmlformats.org/officeDocument/2006/relationships" xmlns:m="http://schemas.openxmlformats.org/officeDocument/2006/math" xmlns:v="urn:schemas-microsoft-com:vml" xmlns:wp14="http://schemas.microsoft.com/office/word/2010/wordprocessingDrawing" xmlns:wp="http://schemas.openxmlformats.org/drawingml/2006/wordprocessingDrawing" xmlns:w10="urn:schemas-microsoft-com:office:word" xmlns:w="http://schemas.openxmlformats.org/wordprocessingml/2006/main" xmlns:w14="http://schemas.microsoft.com/office/word/2010/wordml" xmlns:w15="http://schemas.microsoft.com/office/word/2012/wordml" xmlns:w16cex="http://schemas.microsoft.com/office/word/2018/wordml/cex" xmlns:w16cid="http://schemas.microsoft.com/office/word/2016/wordml/cid" xmlns:w16="http://schemas.microsoft.com/office/word/2018/wordml" xmlns:w16du="http://schemas.microsoft.com/office/word/2023/wordml/word16du" xmlns:w16sdtdh="http://schemas.microsoft.com/office/word/2020/wordml/sdtdatahash" xmlns:w16sdtfl="http://schemas.microsoft.com/office/word/2024/wordml/sdtformatlock" xmlns:w16se="http://schemas.microsoft.com/office/word/2015/wordml/symex" xmlns:wpg="http://schemas.microsoft.com/office/word/2010/wordprocessingGroup" xmlns:wpi="http://schemas.microsoft.com/office/word/2010/wordprocessingInk" xmlns:wne="http://schemas.microsoft.com/office/word/2006/wordml" xmlns:wps="http://schemas.microsoft.com/office/word/2010/wordprocessingShape" mc:Ignorable="w14 w15 w16se w16cid w16 w16cex w16sdtdh w16sdtfl w16du wp14">
   <w:endnote w:type="separator" w:id="-1">
     <w:p>
       <w:r>
@@ -2003,7 +2284,7 @@
 </file>
 
 <file path=word/footnotes.xml><?xml version="1.0" encoding="utf-8"?>
-<w:footnotes xmlns:wpc="http://schemas.microsoft.com/office/word/2010/wordprocessingCanvas" xmlns:cx="http://schemas.microsoft.com/office/drawing/2014/chartex" xmlns:cx1="http://schemas.microsoft.com/office/drawing/2015/9/8/chartex" xmlns:cx2="http://schemas.microsoft.com/office/drawing/2015/10/21/chartex" xmlns:cx3="http://schemas.microsoft.com/office/drawing/2016/5/9/chartex" xmlns:cx4="http://schemas.microsoft.com/office/drawing/2016/5/10/chartex" xmlns:cx5="http://schemas.microsoft.com/office/drawing/2016/5/11/chartex" xmlns:cx6="http://schemas.microsoft.com/office/drawing/2016/5/12/chartex" xmlns:cx7="http://schemas.microsoft.com/office/drawing/2016/5/13/chartex" xmlns:cx8="http://schemas.microsoft.com/office/drawing/2016/5/14/chartex" xmlns:mc="http://schemas.openxmlformats.org/markup-compatibility/2006" xmlns:aink="http://schemas.microsoft.com/office/drawing/2016/ink" xmlns:am3d="http://schemas.microsoft.com/office/drawing/2017/model3d" xmlns:o="urn:schemas-microsoft-com:office:office" xmlns:r="http://schemas.openxmlformats.org/officeDocument/2006/relationships" xmlns:m="http://schemas.openxmlformats.org/officeDocument/2006/math" xmlns:v="urn:schemas-microsoft-com:vml" xmlns:wp14="http://schemas.microsoft.com/office/word/2010/wordprocessingDrawing" xmlns:wp="http://schemas.openxmlformats.org/drawingml/2006/wordprocessingDrawing" xmlns:w10="urn:schemas-microsoft-com:office:word" xmlns:w="http://schemas.openxmlformats.org/wordprocessingml/2006/main" xmlns:w14="http://schemas.microsoft.com/office/word/2010/wordml" xmlns:w15="http://schemas.microsoft.com/office/word/2012/wordml" xmlns:w16cex="http://schemas.microsoft.com/office/word/2018/wordml/cex" xmlns:w16cid="http://schemas.microsoft.com/office/word/2016/wordml/cid" xmlns:w16="http://schemas.microsoft.com/office/word/2018/wordml" xmlns:w16sdtdh="http://schemas.microsoft.com/office/word/2020/wordml/sdtdatahash" xmlns:w16se="http://schemas.microsoft.com/office/word/2015/wordml/symex" xmlns:wpg="http://schemas.microsoft.com/office/word/2010/wordprocessingGroup" xmlns:wpi="http://schemas.microsoft.com/office/word/2010/wordprocessingInk" xmlns:wne="http://schemas.microsoft.com/office/word/2006/wordml" xmlns:wps="http://schemas.microsoft.com/office/word/2010/wordprocessingShape" mc:Ignorable="w14 w15 w16se w16cid w16 w16cex w16sdtdh wp14">
+<w:footnotes xmlns:wpc="http://schemas.microsoft.com/office/word/2010/wordprocessingCanvas" xmlns:cx="http://schemas.microsoft.com/office/drawing/2014/chartex" xmlns:cx1="http://schemas.microsoft.com/office/drawing/2015/9/8/chartex" xmlns:cx2="http://schemas.microsoft.com/office/drawing/2015/10/21/chartex" xmlns:cx3="http://schemas.microsoft.com/office/drawing/2016/5/9/chartex" xmlns:cx4="http://schemas.microsoft.com/office/drawing/2016/5/10/chartex" xmlns:cx5="http://schemas.microsoft.com/office/drawing/2016/5/11/chartex" xmlns:cx6="http://schemas.microsoft.com/office/drawing/2016/5/12/chartex" xmlns:cx7="http://schemas.microsoft.com/office/drawing/2016/5/13/chartex" xmlns:cx8="http://schemas.microsoft.com/office/drawing/2016/5/14/chartex" xmlns:mc="http://schemas.openxmlformats.org/markup-compatibility/2006" xmlns:aink="http://schemas.microsoft.com/office/drawing/2016/ink" xmlns:am3d="http://schemas.microsoft.com/office/drawing/2017/model3d" xmlns:o="urn:schemas-microsoft-com:office:office" xmlns:oel="http://schemas.microsoft.com/office/2019/extlst" xmlns:r="http://schemas.openxmlformats.org/officeDocument/2006/relationships" xmlns:m="http://schemas.openxmlformats.org/officeDocument/2006/math" xmlns:v="urn:schemas-microsoft-com:vml" xmlns:wp14="http://schemas.microsoft.com/office/word/2010/wordprocessingDrawing" xmlns:wp="http://schemas.openxmlformats.org/drawingml/2006/wordprocessingDrawing" xmlns:w10="urn:schemas-microsoft-com:office:word" xmlns:w="http://schemas.openxmlformats.org/wordprocessingml/2006/main" xmlns:w14="http://schemas.microsoft.com/office/word/2010/wordml" xmlns:w15="http://schemas.microsoft.com/office/word/2012/wordml" xmlns:w16cex="http://schemas.microsoft.com/office/word/2018/wordml/cex" xmlns:w16cid="http://schemas.microsoft.com/office/word/2016/wordml/cid" xmlns:w16="http://schemas.microsoft.com/office/word/2018/wordml" xmlns:w16du="http://schemas.microsoft.com/office/word/2023/wordml/word16du" xmlns:w16sdtdh="http://schemas.microsoft.com/office/word/2020/wordml/sdtdatahash" xmlns:w16sdtfl="http://schemas.microsoft.com/office/word/2024/wordml/sdtformatlock" xmlns:w16se="http://schemas.microsoft.com/office/word/2015/wordml/symex" xmlns:wpg="http://schemas.microsoft.com/office/word/2010/wordprocessingGroup" xmlns:wpi="http://schemas.microsoft.com/office/word/2010/wordprocessingInk" xmlns:wne="http://schemas.microsoft.com/office/word/2006/wordml" xmlns:wps="http://schemas.microsoft.com/office/word/2010/wordprocessingShape" mc:Ignorable="w14 w15 w16se w16cid w16 w16cex w16sdtdh w16sdtfl w16du wp14">
   <w:footnote w:type="separator" w:id="-1">
     <w:p>
       <w:r>
@@ -2022,7 +2303,7 @@
 </file>
 
 <file path=word/header1.xml><?xml version="1.0" encoding="utf-8"?>
-<w:hdr xmlns:wpc="http://schemas.microsoft.com/office/word/2010/wordprocessingCanvas" xmlns:cx="http://schemas.microsoft.com/office/drawing/2014/chartex" xmlns:cx1="http://schemas.microsoft.com/office/drawing/2015/9/8/chartex" xmlns:cx2="http://schemas.microsoft.com/office/drawing/2015/10/21/chartex" xmlns:cx3="http://schemas.microsoft.com/office/drawing/2016/5/9/chartex" xmlns:cx4="http://schemas.microsoft.com/office/drawing/2016/5/10/chartex" xmlns:cx5="http://schemas.microsoft.com/office/drawing/2016/5/11/chartex" xmlns:cx6="http://schemas.microsoft.com/office/drawing/2016/5/12/chartex" xmlns:cx7="http://schemas.microsoft.com/office/drawing/2016/5/13/chartex" xmlns:cx8="http://schemas.microsoft.com/office/drawing/2016/5/14/chartex" xmlns:mc="http://schemas.openxmlformats.org/markup-compatibility/2006" xmlns:aink="http://schemas.microsoft.com/office/drawing/2016/ink" xmlns:am3d="http://schemas.microsoft.com/office/drawing/2017/model3d" xmlns:o="urn:schemas-microsoft-com:office:office" xmlns:r="http://schemas.openxmlformats.org/officeDocument/2006/relationships" xmlns:m="http://schemas.openxmlformats.org/officeDocument/2006/math" xmlns:v="urn:schemas-microsoft-com:vml" xmlns:wp14="http://schemas.microsoft.com/office/word/2010/wordprocessingDrawing" xmlns:wp="http://schemas.openxmlformats.org/drawingml/2006/wordprocessingDrawing" xmlns:w10="urn:schemas-microsoft-com:office:word" xmlns:w="http://schemas.openxmlformats.org/wordprocessingml/2006/main" xmlns:w14="http://schemas.microsoft.com/office/word/2010/wordml" xmlns:w15="http://schemas.microsoft.com/office/word/2012/wordml" xmlns:w16cex="http://schemas.microsoft.com/office/word/2018/wordml/cex" xmlns:w16cid="http://schemas.microsoft.com/office/word/2016/wordml/cid" xmlns:w16="http://schemas.microsoft.com/office/word/2018/wordml" xmlns:w16sdtdh="http://schemas.microsoft.com/office/word/2020/wordml/sdtdatahash" xmlns:w16se="http://schemas.microsoft.com/office/word/2015/wordml/symex" xmlns:wpg="http://schemas.microsoft.com/office/word/2010/wordprocessingGroup" xmlns:wpi="http://schemas.microsoft.com/office/word/2010/wordprocessingInk" xmlns:wne="http://schemas.microsoft.com/office/word/2006/wordml" xmlns:wps="http://schemas.microsoft.com/office/word/2010/wordprocessingShape" mc:Ignorable="w14 w15 w16se w16cid w16 w16cex w16sdtdh wp14">
+<w:hdr xmlns:wpc="http://schemas.microsoft.com/office/word/2010/wordprocessingCanvas" xmlns:cx="http://schemas.microsoft.com/office/drawing/2014/chartex" xmlns:cx1="http://schemas.microsoft.com/office/drawing/2015/9/8/chartex" xmlns:cx2="http://schemas.microsoft.com/office/drawing/2015/10/21/chartex" xmlns:cx3="http://schemas.microsoft.com/office/drawing/2016/5/9/chartex" xmlns:cx4="http://schemas.microsoft.com/office/drawing/2016/5/10/chartex" xmlns:cx5="http://schemas.microsoft.com/office/drawing/2016/5/11/chartex" xmlns:cx6="http://schemas.microsoft.com/office/drawing/2016/5/12/chartex" xmlns:cx7="http://schemas.microsoft.com/office/drawing/2016/5/13/chartex" xmlns:cx8="http://schemas.microsoft.com/office/drawing/2016/5/14/chartex" xmlns:mc="http://schemas.openxmlformats.org/markup-compatibility/2006" xmlns:aink="http://schemas.microsoft.com/office/drawing/2016/ink" xmlns:am3d="http://schemas.microsoft.com/office/drawing/2017/model3d" xmlns:o="urn:schemas-microsoft-com:office:office" xmlns:oel="http://schemas.microsoft.com/office/2019/extlst" xmlns:r="http://schemas.openxmlformats.org/officeDocument/2006/relationships" xmlns:m="http://schemas.openxmlformats.org/officeDocument/2006/math" xmlns:v="urn:schemas-microsoft-com:vml" xmlns:wp14="http://schemas.microsoft.com/office/word/2010/wordprocessingDrawing" xmlns:wp="http://schemas.openxmlformats.org/drawingml/2006/wordprocessingDrawing" xmlns:w10="urn:schemas-microsoft-com:office:word" xmlns:w="http://schemas.openxmlformats.org/wordprocessingml/2006/main" xmlns:w14="http://schemas.microsoft.com/office/word/2010/wordml" xmlns:w15="http://schemas.microsoft.com/office/word/2012/wordml" xmlns:w16cex="http://schemas.microsoft.com/office/word/2018/wordml/cex" xmlns:w16cid="http://schemas.microsoft.com/office/word/2016/wordml/cid" xmlns:w16="http://schemas.microsoft.com/office/word/2018/wordml" xmlns:w16du="http://schemas.microsoft.com/office/word/2023/wordml/word16du" xmlns:w16sdtdh="http://schemas.microsoft.com/office/word/2020/wordml/sdtdatahash" xmlns:w16sdtfl="http://schemas.microsoft.com/office/word/2024/wordml/sdtformatlock" xmlns:w16se="http://schemas.microsoft.com/office/word/2015/wordml/symex" xmlns:wpg="http://schemas.microsoft.com/office/word/2010/wordprocessingGroup" xmlns:wpi="http://schemas.microsoft.com/office/word/2010/wordprocessingInk" xmlns:wne="http://schemas.microsoft.com/office/word/2006/wordml" xmlns:wps="http://schemas.microsoft.com/office/word/2010/wordprocessingShape" mc:Ignorable="w14 w15 w16se w16cid w16 w16cex w16sdtdh w16sdtfl w16du wp14">
   <w:p>
     <w:pPr>
       <w:pStyle w:val="BodyText"/>
@@ -2111,7 +2392,7 @@
 </file>
 
 <file path=word/numbering.xml><?xml version="1.0" encoding="utf-8"?>
-<w:numbering xmlns:wpc="http://schemas.microsoft.com/office/word/2010/wordprocessingCanvas" xmlns:cx="http://schemas.microsoft.com/office/drawing/2014/chartex" xmlns:cx1="http://schemas.microsoft.com/office/drawing/2015/9/8/chartex" xmlns:cx2="http://schemas.microsoft.com/office/drawing/2015/10/21/chartex" xmlns:cx3="http://schemas.microsoft.com/office/drawing/2016/5/9/chartex" xmlns:cx4="http://schemas.microsoft.com/office/drawing/2016/5/10/chartex" xmlns:cx5="http://schemas.microsoft.com/office/drawing/2016/5/11/chartex" xmlns:cx6="http://schemas.microsoft.com/office/drawing/2016/5/12/chartex" xmlns:cx7="http://schemas.microsoft.com/office/drawing/2016/5/13/chartex" xmlns:cx8="http://schemas.microsoft.com/office/drawing/2016/5/14/chartex" xmlns:mc="http://schemas.openxmlformats.org/markup-compatibility/2006" xmlns:aink="http://schemas.microsoft.com/office/drawing/2016/ink" xmlns:am3d="http://schemas.microsoft.com/office/drawing/2017/model3d" xmlns:o="urn:schemas-microsoft-com:office:office" xmlns:r="http://schemas.openxmlformats.org/officeDocument/2006/relationships" xmlns:m="http://schemas.openxmlformats.org/officeDocument/2006/math" xmlns:v="urn:schemas-microsoft-com:vml" xmlns:wp14="http://schemas.microsoft.com/office/word/2010/wordprocessingDrawing" xmlns:wp="http://schemas.openxmlformats.org/drawingml/2006/wordprocessingDrawing" xmlns:w10="urn:schemas-microsoft-com:office:word" xmlns:w="http://schemas.openxmlformats.org/wordprocessingml/2006/main" xmlns:w14="http://schemas.microsoft.com/office/word/2010/wordml" xmlns:w15="http://schemas.microsoft.com/office/word/2012/wordml" xmlns:w16cex="http://schemas.microsoft.com/office/word/2018/wordml/cex" xmlns:w16cid="http://schemas.microsoft.com/office/word/2016/wordml/cid" xmlns:w16="http://schemas.microsoft.com/office/word/2018/wordml" xmlns:w16sdtdh="http://schemas.microsoft.com/office/word/2020/wordml/sdtdatahash" xmlns:w16se="http://schemas.microsoft.com/office/word/2015/wordml/symex" xmlns:wpg="http://schemas.microsoft.com/office/word/2010/wordprocessingGroup" xmlns:wpi="http://schemas.microsoft.com/office/word/2010/wordprocessingInk" xmlns:wne="http://schemas.microsoft.com/office/word/2006/wordml" xmlns:wps="http://schemas.microsoft.com/office/word/2010/wordprocessingShape" mc:Ignorable="w14 w15 w16se w16cid w16 w16cex w16sdtdh wp14">
+<w:numbering xmlns:wpc="http://schemas.microsoft.com/office/word/2010/wordprocessingCanvas" xmlns:cx="http://schemas.microsoft.com/office/drawing/2014/chartex" xmlns:cx1="http://schemas.microsoft.com/office/drawing/2015/9/8/chartex" xmlns:cx2="http://schemas.microsoft.com/office/drawing/2015/10/21/chartex" xmlns:cx3="http://schemas.microsoft.com/office/drawing/2016/5/9/chartex" xmlns:cx4="http://schemas.microsoft.com/office/drawing/2016/5/10/chartex" xmlns:cx5="http://schemas.microsoft.com/office/drawing/2016/5/11/chartex" xmlns:cx6="http://schemas.microsoft.com/office/drawing/2016/5/12/chartex" xmlns:cx7="http://schemas.microsoft.com/office/drawing/2016/5/13/chartex" xmlns:cx8="http://schemas.microsoft.com/office/drawing/2016/5/14/chartex" xmlns:mc="http://schemas.openxmlformats.org/markup-compatibility/2006" xmlns:aink="http://schemas.microsoft.com/office/drawing/2016/ink" xmlns:am3d="http://schemas.microsoft.com/office/drawing/2017/model3d" xmlns:o="urn:schemas-microsoft-com:office:office" xmlns:oel="http://schemas.microsoft.com/office/2019/extlst" xmlns:r="http://schemas.openxmlformats.org/officeDocument/2006/relationships" xmlns:m="http://schemas.openxmlformats.org/officeDocument/2006/math" xmlns:v="urn:schemas-microsoft-com:vml" xmlns:wp14="http://schemas.microsoft.com/office/word/2010/wordprocessingDrawing" xmlns:wp="http://schemas.openxmlformats.org/drawingml/2006/wordprocessingDrawing" xmlns:w10="urn:schemas-microsoft-com:office:word" xmlns:w="http://schemas.openxmlformats.org/wordprocessingml/2006/main" xmlns:w14="http://schemas.microsoft.com/office/word/2010/wordml" xmlns:w15="http://schemas.microsoft.com/office/word/2012/wordml" xmlns:w16cex="http://schemas.microsoft.com/office/word/2018/wordml/cex" xmlns:w16cid="http://schemas.microsoft.com/office/word/2016/wordml/cid" xmlns:w16="http://schemas.microsoft.com/office/word/2018/wordml" xmlns:w16du="http://schemas.microsoft.com/office/word/2023/wordml/word16du" xmlns:w16sdtdh="http://schemas.microsoft.com/office/word/2020/wordml/sdtdatahash" xmlns:w16sdtfl="http://schemas.microsoft.com/office/word/2024/wordml/sdtformatlock" xmlns:w16se="http://schemas.microsoft.com/office/word/2015/wordml/symex" xmlns:wpg="http://schemas.microsoft.com/office/word/2010/wordprocessingGroup" xmlns:wpi="http://schemas.microsoft.com/office/word/2010/wordprocessingInk" xmlns:wne="http://schemas.microsoft.com/office/word/2006/wordml" xmlns:wps="http://schemas.microsoft.com/office/word/2010/wordprocessingShape" mc:Ignorable="w14 w15 w16se w16cid w16 w16cex w16sdtdh w16sdtfl w16du wp14">
   <w:abstractNum w:abstractNumId="0" w15:restartNumberingAfterBreak="0">
     <w:nsid w:val="09C0446D"/>
     <w:multiLevelType w:val="hybridMultilevel"/>
@@ -3621,50 +3902,50 @@
       </w:rPr>
     </w:lvl>
   </w:abstractNum>
-  <w:num w:numId="1">
+  <w:num w:numId="1" w16cid:durableId="1962152955">
     <w:abstractNumId w:val="3"/>
   </w:num>
-  <w:num w:numId="2">
+  <w:num w:numId="2" w16cid:durableId="334454944">
     <w:abstractNumId w:val="1"/>
   </w:num>
-  <w:num w:numId="3">
+  <w:num w:numId="3" w16cid:durableId="1322782035">
     <w:abstractNumId w:val="6"/>
   </w:num>
-  <w:num w:numId="4">
+  <w:num w:numId="4" w16cid:durableId="378938653">
     <w:abstractNumId w:val="0"/>
   </w:num>
-  <w:num w:numId="5">
+  <w:num w:numId="5" w16cid:durableId="1818109587">
     <w:abstractNumId w:val="11"/>
   </w:num>
-  <w:num w:numId="6">
+  <w:num w:numId="6" w16cid:durableId="1728797940">
     <w:abstractNumId w:val="7"/>
   </w:num>
-  <w:num w:numId="7">
+  <w:num w:numId="7" w16cid:durableId="1711103471">
     <w:abstractNumId w:val="12"/>
   </w:num>
-  <w:num w:numId="8">
+  <w:num w:numId="8" w16cid:durableId="1539049312">
     <w:abstractNumId w:val="4"/>
   </w:num>
-  <w:num w:numId="9">
+  <w:num w:numId="9" w16cid:durableId="2002005675">
     <w:abstractNumId w:val="5"/>
   </w:num>
-  <w:num w:numId="10">
+  <w:num w:numId="10" w16cid:durableId="2079554806">
     <w:abstractNumId w:val="8"/>
   </w:num>
-  <w:num w:numId="11">
+  <w:num w:numId="11" w16cid:durableId="769349002">
     <w:abstractNumId w:val="2"/>
   </w:num>
-  <w:num w:numId="12">
+  <w:num w:numId="12" w16cid:durableId="280459381">
     <w:abstractNumId w:val="9"/>
   </w:num>
-  <w:num w:numId="13">
+  <w:num w:numId="13" w16cid:durableId="224266210">
     <w:abstractNumId w:val="10"/>
   </w:num>
 </w:numbering>
 </file>
 
 <file path=word/styles.xml><?xml version="1.0" encoding="utf-8"?>
-<w:styles xmlns:mc="http://schemas.openxmlformats.org/markup-compatibility/2006" xmlns:r="http://schemas.openxmlformats.org/officeDocument/2006/relationships" xmlns:w="http://schemas.openxmlformats.org/wordprocessingml/2006/main" xmlns:w14="http://schemas.microsoft.com/office/word/2010/wordml" xmlns:w15="http://schemas.microsoft.com/office/word/2012/wordml" xmlns:w16cex="http://schemas.microsoft.com/office/word/2018/wordml/cex" xmlns:w16cid="http://schemas.microsoft.com/office/word/2016/wordml/cid" xmlns:w16="http://schemas.microsoft.com/office/word/2018/wordml" xmlns:w16sdtdh="http://schemas.microsoft.com/office/word/2020/wordml/sdtdatahash" xmlns:w16se="http://schemas.microsoft.com/office/word/2015/wordml/symex" mc:Ignorable="w14 w15 w16se w16cid w16 w16cex w16sdtdh">
+<w:styles xmlns:mc="http://schemas.openxmlformats.org/markup-compatibility/2006" xmlns:r="http://schemas.openxmlformats.org/officeDocument/2006/relationships" xmlns:w="http://schemas.openxmlformats.org/wordprocessingml/2006/main" xmlns:w14="http://schemas.microsoft.com/office/word/2010/wordml" xmlns:w15="http://schemas.microsoft.com/office/word/2012/wordml" xmlns:w16cex="http://schemas.microsoft.com/office/word/2018/wordml/cex" xmlns:w16cid="http://schemas.microsoft.com/office/word/2016/wordml/cid" xmlns:w16="http://schemas.microsoft.com/office/word/2018/wordml" xmlns:w16du="http://schemas.microsoft.com/office/word/2023/wordml/word16du" xmlns:w16sdtdh="http://schemas.microsoft.com/office/word/2020/wordml/sdtdatahash" xmlns:w16sdtfl="http://schemas.microsoft.com/office/word/2024/wordml/sdtformatlock" xmlns:w16se="http://schemas.microsoft.com/office/word/2015/wordml/symex" mc:Ignorable="w14 w15 w16se w16cid w16 w16cex w16sdtdh w16sdtfl w16du">
   <w:docDefaults>
     <w:rPrDefault>
       <w:rPr>

</xml_diff>